<commit_message>
update on the CV
</commit_message>
<xml_diff>
--- a/templates/CV.docx
+++ b/templates/CV.docx
@@ -163,10 +163,9 @@
     </w:p>
     <w:p>
       <w:r>
-        <w:t>Motivated and hardworking Software Engineering student seeking opportunities to apply and improve technical skills in software development, programming, and system design. Passionate about technology, problem-solving, and developing innovative software solutions while gaining practical industry experience.</w:t>
-      </w:r>
-    </w:p>
-    <w:p/>
+        <w:t>Aspiring Software Engineer and Diploma student at Uganda Institute of ICT with practical experience in Python programming, SQL/database concepts, backend development, API integration, HTML and CSS. Passionate about building reliable, user-focused software solutions and applying software engineering principles to real-world problems. Currently seeking an internship opportunity to strengthen professional development skills, contribute to software projects, learn from experienced developers, and gain hands-on experience in the software development lifecycle.</w:t>
+      </w:r>
+    </w:p>
     <w:p>
       <w:pPr>
         <w:rPr>
@@ -183,61 +182,45 @@
       </w:r>
     </w:p>
     <w:p>
-      <w:r>
-        <w:rPr>
-          <w:b/>
-          <w:bCs/>
-        </w:rPr>
-        <w:t>D</w:t>
-      </w:r>
-      <w:r>
-        <w:rPr>
-          <w:b/>
-          <w:bCs/>
-        </w:rPr>
-        <w:t>iploma</w:t>
-      </w:r>
-      <w:r>
-        <w:rPr>
-          <w:b/>
-          <w:bCs/>
-        </w:rPr>
-        <w:t xml:space="preserve"> </w:t>
-      </w:r>
-      <w:r>
-        <w:rPr>
-          <w:b/>
-          <w:bCs/>
-        </w:rPr>
-        <w:t xml:space="preserve"> of Software Engineering</w:t>
-      </w:r>
-      <w:r>
+      <w:pPr>
+        <w:rPr>
+          <w:b/>
+          <w:bCs/>
+        </w:rPr>
+      </w:pPr>
+      <w:r>
+        <w:rPr>
+          <w:b/>
+          <w:bCs/>
+        </w:rPr>
+        <w:t>Diploma in Software Engineering</w:t>
+      </w:r>
+      <w:r>
+        <w:rPr>
+          <w:b/>
+          <w:bCs/>
+        </w:rPr>
         <w:br/>
-        <w:t xml:space="preserve">Year: </w:t>
-      </w:r>
-      <w:r>
-        <w:t>2025</w:t>
-      </w:r>
-      <w:r>
-        <w:t>– Present</w:t>
-      </w:r>
-    </w:p>
-    <w:p>
-      <w:pPr>
-        <w:rPr>
-          <w:b/>
-          <w:bCs/>
-        </w:rPr>
-      </w:pPr>
-      <w:r>
-        <w:rPr>
-          <w:b/>
-          <w:bCs/>
-        </w:rPr>
-        <w:t>Uganda institute of ICT</w:t>
-      </w:r>
-    </w:p>
-    <w:p>
+        <w:t>Uganda Institute of ICT (UICT), Nakawa</w:t>
+      </w:r>
+      <w:r>
+        <w:rPr>
+          <w:b/>
+          <w:bCs/>
+        </w:rPr>
+        <w:br/>
+      </w:r>
+      <w:r>
+        <w:t>2025 – Present</w:t>
+      </w:r>
+    </w:p>
+    <w:p>
+      <w:pPr>
+        <w:rPr>
+          <w:b/>
+          <w:bCs/>
+        </w:rPr>
+      </w:pPr>
       <w:r>
         <w:rPr>
           <w:b/>
@@ -246,22 +229,39 @@
         <w:t>Uganda Advanced Certificate of Education (UACE)</w:t>
       </w:r>
       <w:r>
+        <w:rPr>
+          <w:b/>
+          <w:bCs/>
+        </w:rPr>
         <w:br/>
-        <w:t>Year:</w:t>
-      </w:r>
-      <w:r>
-        <w:t xml:space="preserve"> 2023-2024</w:t>
-      </w:r>
-    </w:p>
-    <w:p>
-      <w:r>
-        <w:t xml:space="preserve">St Aloysius Girls </w:t>
+        <w:t xml:space="preserve">St. Aloysius Girls </w:t>
       </w:r>
       <w:proofErr w:type="spellStart"/>
       <w:r>
+        <w:rPr>
+          <w:b/>
+          <w:bCs/>
+        </w:rPr>
         <w:t>Kitanga</w:t>
       </w:r>
       <w:proofErr w:type="spellEnd"/>
+      <w:r>
+        <w:rPr>
+          <w:b/>
+          <w:bCs/>
+        </w:rPr>
+        <w:t xml:space="preserve"> S.S.</w:t>
+      </w:r>
+      <w:r>
+        <w:rPr>
+          <w:b/>
+          <w:bCs/>
+        </w:rPr>
+        <w:br/>
+      </w:r>
+      <w:r>
+        <w:t>2023 – 2024</w:t>
+      </w:r>
     </w:p>
     <w:p>
       <w:r>
@@ -272,22 +272,47 @@
         <w:t>Uganda Certificate of Education (UCE)</w:t>
       </w:r>
       <w:r>
+        <w:rPr>
+          <w:b/>
+          <w:bCs/>
+        </w:rPr>
         <w:br/>
-        <w:t xml:space="preserve">Year: </w:t>
-      </w:r>
-      <w:r>
-        <w:t>2018-2022</w:t>
-      </w:r>
-    </w:p>
-    <w:p>
-      <w:r>
-        <w:t xml:space="preserve">St Aloysius Girls </w:t>
+        <w:t xml:space="preserve">St. Aloysius Girls </w:t>
       </w:r>
       <w:proofErr w:type="spellStart"/>
       <w:r>
+        <w:rPr>
+          <w:b/>
+          <w:bCs/>
+        </w:rPr>
         <w:t>Kitanga</w:t>
       </w:r>
       <w:proofErr w:type="spellEnd"/>
+      <w:r>
+        <w:rPr>
+          <w:b/>
+          <w:bCs/>
+        </w:rPr>
+        <w:t xml:space="preserve"> S.S.</w:t>
+      </w:r>
+      <w:r>
+        <w:rPr>
+          <w:b/>
+          <w:bCs/>
+        </w:rPr>
+        <w:br/>
+      </w:r>
+      <w:r>
+        <w:t>2018 – 2022</w:t>
+      </w:r>
+    </w:p>
+    <w:p>
+      <w:pPr>
+        <w:rPr>
+          <w:b/>
+          <w:bCs/>
+        </w:rPr>
+      </w:pPr>
     </w:p>
     <w:p>
       <w:pPr>
@@ -309,20 +334,11 @@
         <w:pStyle w:val="ListParagraph"/>
         <w:numPr>
           <w:ilvl w:val="0"/>
-          <w:numId w:val="6"/>
+          <w:numId w:val="12"/>
         </w:numPr>
       </w:pPr>
       <w:r>
-        <w:t>Introduction to cyber</w:t>
-      </w:r>
-      <w:r>
-        <w:t xml:space="preserve">security Awareness </w:t>
-      </w:r>
-      <w:r>
-        <w:tab/>
-      </w:r>
-      <w:r>
-        <w:t xml:space="preserve">         HP Foundation online course</w:t>
+        <w:t xml:space="preserve">Python Essentials 1 — Cisco Networking Academy </w:t>
       </w:r>
     </w:p>
     <w:p>
@@ -330,30 +346,11 @@
         <w:pStyle w:val="ListParagraph"/>
         <w:numPr>
           <w:ilvl w:val="0"/>
-          <w:numId w:val="6"/>
+          <w:numId w:val="12"/>
         </w:numPr>
       </w:pPr>
       <w:r>
-        <w:t>AI for Beg</w:t>
-      </w:r>
-      <w:r>
-        <w:t>inners</w:t>
-      </w:r>
-      <w:r>
-        <w:tab/>
-      </w:r>
-      <w:r>
-        <w:tab/>
-      </w:r>
-      <w:r>
-        <w:tab/>
-      </w:r>
-      <w:r>
-        <w:tab/>
-        <w:t xml:space="preserve">          </w:t>
-      </w:r>
-      <w:r>
-        <w:t>HP Foundation online course</w:t>
+        <w:t xml:space="preserve">Introduction to Cybersecurity Awareness — HP Foundation </w:t>
       </w:r>
     </w:p>
     <w:p>
@@ -361,36 +358,11 @@
         <w:pStyle w:val="ListParagraph"/>
         <w:numPr>
           <w:ilvl w:val="0"/>
-          <w:numId w:val="6"/>
+          <w:numId w:val="12"/>
         </w:numPr>
       </w:pPr>
       <w:r>
-        <w:t xml:space="preserve">AI for </w:t>
-      </w:r>
-      <w:r>
-        <w:t>Business</w:t>
-      </w:r>
-      <w:r>
-        <w:t xml:space="preserve"> </w:t>
-      </w:r>
-      <w:r>
-        <w:t>P</w:t>
-      </w:r>
-      <w:r>
-        <w:t>rofe</w:t>
-      </w:r>
-      <w:r>
-        <w:t>ssionals</w:t>
-      </w:r>
-      <w:r>
-        <w:tab/>
-      </w:r>
-      <w:r>
-        <w:tab/>
-        <w:t xml:space="preserve">         </w:t>
-      </w:r>
-      <w:r>
-        <w:t>HP Foundation online course</w:t>
+        <w:t xml:space="preserve">AI for Beginners — HP Foundation </w:t>
       </w:r>
     </w:p>
     <w:p>
@@ -398,67 +370,220 @@
         <w:pStyle w:val="ListParagraph"/>
         <w:numPr>
           <w:ilvl w:val="0"/>
-          <w:numId w:val="6"/>
+          <w:numId w:val="12"/>
         </w:numPr>
       </w:pPr>
       <w:r>
-        <w:t xml:space="preserve">Agile Project management </w:t>
-      </w:r>
-      <w:r>
-        <w:tab/>
-      </w:r>
-      <w:r>
-        <w:tab/>
-      </w:r>
-      <w:r>
-        <w:tab/>
-        <w:t xml:space="preserve">          </w:t>
-      </w:r>
-      <w:r>
-        <w:t>HP Foundation online course</w:t>
-      </w:r>
-    </w:p>
-    <w:p/>
-    <w:p/>
-    <w:p>
-      <w:pPr>
-        <w:rPr>
-          <w:b/>
-          <w:bCs/>
-        </w:rPr>
-      </w:pPr>
-      <w:r>
-        <w:rPr>
-          <w:b/>
-          <w:bCs/>
-        </w:rPr>
-        <w:lastRenderedPageBreak/>
-        <w:t>TECHNICAL SKILLS</w:t>
-      </w:r>
-    </w:p>
-    <w:p>
-      <w:pPr>
+        <w:t xml:space="preserve">AI for Business Professionals — HP Foundation </w:t>
+      </w:r>
+    </w:p>
+    <w:p>
+      <w:pPr>
+        <w:pStyle w:val="ListParagraph"/>
         <w:numPr>
           <w:ilvl w:val="0"/>
-          <w:numId w:val="1"/>
+          <w:numId w:val="12"/>
         </w:numPr>
       </w:pPr>
       <w:r>
-        <w:t>Python Programming</w:t>
+        <w:t>Agile Project Management — HP Foundation</w:t>
+      </w:r>
+    </w:p>
+    <w:p/>
+    <w:p>
+      <w:pPr>
+        <w:rPr>
+          <w:b/>
+          <w:bCs/>
+        </w:rPr>
+      </w:pPr>
+      <w:r>
+        <w:rPr>
+          <w:b/>
+          <w:bCs/>
+        </w:rPr>
+        <w:t>TECHNICAL SKILLS</w:t>
+      </w:r>
+    </w:p>
+    <w:p>
+      <w:r>
+        <w:rPr>
+          <w:b/>
+          <w:bCs/>
+        </w:rPr>
+        <w:t>Programming Languages</w:t>
       </w:r>
     </w:p>
     <w:p>
       <w:pPr>
         <w:numPr>
           <w:ilvl w:val="0"/>
-          <w:numId w:val="1"/>
+          <w:numId w:val="7"/>
         </w:numPr>
       </w:pPr>
       <w:r>
-        <w:t xml:space="preserve">Problem solving </w:t>
-      </w:r>
-    </w:p>
-    <w:p/>
+        <w:t xml:space="preserve">Python </w:t>
+      </w:r>
+    </w:p>
+    <w:p>
+      <w:pPr>
+        <w:numPr>
+          <w:ilvl w:val="0"/>
+          <w:numId w:val="7"/>
+        </w:numPr>
+      </w:pPr>
+      <w:r>
+        <w:t xml:space="preserve">HTML </w:t>
+      </w:r>
+    </w:p>
+    <w:p>
+      <w:pPr>
+        <w:numPr>
+          <w:ilvl w:val="0"/>
+          <w:numId w:val="7"/>
+        </w:numPr>
+      </w:pPr>
+      <w:r>
+        <w:t xml:space="preserve">CSS </w:t>
+      </w:r>
+    </w:p>
+    <w:p>
+      <w:r>
+        <w:rPr>
+          <w:b/>
+          <w:bCs/>
+        </w:rPr>
+        <w:t>Backend Development</w:t>
+      </w:r>
+    </w:p>
+    <w:p>
+      <w:pPr>
+        <w:numPr>
+          <w:ilvl w:val="0"/>
+          <w:numId w:val="8"/>
+        </w:numPr>
+      </w:pPr>
+      <w:r>
+        <w:t xml:space="preserve">Flask </w:t>
+      </w:r>
+    </w:p>
+    <w:p>
+      <w:pPr>
+        <w:numPr>
+          <w:ilvl w:val="0"/>
+          <w:numId w:val="8"/>
+        </w:numPr>
+      </w:pPr>
+      <w:r>
+        <w:t xml:space="preserve">API integration </w:t>
+      </w:r>
+    </w:p>
+    <w:p>
+      <w:pPr>
+        <w:numPr>
+          <w:ilvl w:val="0"/>
+          <w:numId w:val="8"/>
+        </w:numPr>
+      </w:pPr>
+      <w:r>
+        <w:t xml:space="preserve">Django </w:t>
+      </w:r>
+    </w:p>
+    <w:p>
+      <w:r>
+        <w:rPr>
+          <w:b/>
+          <w:bCs/>
+        </w:rPr>
+        <w:t>Software Engineering</w:t>
+      </w:r>
+    </w:p>
+    <w:p>
+      <w:pPr>
+        <w:numPr>
+          <w:ilvl w:val="0"/>
+          <w:numId w:val="10"/>
+        </w:numPr>
+      </w:pPr>
+      <w:r>
+        <w:t xml:space="preserve">Object-Oriented Programming </w:t>
+      </w:r>
+    </w:p>
+    <w:p>
+      <w:pPr>
+        <w:numPr>
+          <w:ilvl w:val="0"/>
+          <w:numId w:val="10"/>
+        </w:numPr>
+      </w:pPr>
+      <w:r>
+        <w:t xml:space="preserve">Software Development Life Cycle (SDLC) </w:t>
+      </w:r>
+    </w:p>
+    <w:p>
+      <w:pPr>
+        <w:numPr>
+          <w:ilvl w:val="0"/>
+          <w:numId w:val="10"/>
+        </w:numPr>
+      </w:pPr>
+      <w:r>
+        <w:t xml:space="preserve">Agile methodologies </w:t>
+      </w:r>
+    </w:p>
+    <w:p>
+      <w:pPr>
+        <w:numPr>
+          <w:ilvl w:val="0"/>
+          <w:numId w:val="10"/>
+        </w:numPr>
+      </w:pPr>
+      <w:r>
+        <w:t xml:space="preserve">Problem solving and debugging </w:t>
+      </w:r>
+    </w:p>
+    <w:p>
+      <w:pPr>
+        <w:numPr>
+          <w:ilvl w:val="0"/>
+          <w:numId w:val="10"/>
+        </w:numPr>
+      </w:pPr>
+      <w:r>
+        <w:t xml:space="preserve">Software design principles </w:t>
+      </w:r>
+    </w:p>
+    <w:p>
+      <w:r>
+        <w:rPr>
+          <w:b/>
+          <w:bCs/>
+        </w:rPr>
+        <w:t>Development Tools</w:t>
+      </w:r>
+    </w:p>
+    <w:p>
+      <w:pPr>
+        <w:numPr>
+          <w:ilvl w:val="0"/>
+          <w:numId w:val="11"/>
+        </w:numPr>
+      </w:pPr>
+      <w:r>
+        <w:t xml:space="preserve">GitHub </w:t>
+      </w:r>
+    </w:p>
+    <w:p>
+      <w:pPr>
+        <w:numPr>
+          <w:ilvl w:val="0"/>
+          <w:numId w:val="11"/>
+        </w:numPr>
+      </w:pPr>
+      <w:r>
+        <w:t xml:space="preserve">Visual Studio Code </w:t>
+      </w:r>
+    </w:p>
     <w:p>
       <w:pPr>
         <w:rPr>
@@ -472,21 +597,6 @@
           <w:bCs/>
         </w:rPr>
         <w:t>PROJECTS</w:t>
-      </w:r>
-    </w:p>
-    <w:p>
-      <w:pPr>
-        <w:rPr>
-          <w:b/>
-          <w:bCs/>
-        </w:rPr>
-      </w:pPr>
-      <w:r>
-        <w:rPr>
-          <w:b/>
-          <w:bCs/>
-        </w:rPr>
-        <w:t>Task Management API System</w:t>
       </w:r>
     </w:p>
     <w:p>
@@ -497,24 +607,19 @@
         </w:numPr>
       </w:pPr>
       <w:r>
-        <w:t>Learning API integration and backend development.</w:t>
-      </w:r>
-    </w:p>
-    <w:p>
-      <w:pPr>
-        <w:numPr>
-          <w:ilvl w:val="0"/>
-          <w:numId w:val="2"/>
-        </w:numPr>
-      </w:pPr>
-      <w:r>
-        <w:t>learning</w:t>
-      </w:r>
-      <w:r>
-        <w:t xml:space="preserve"> Python and database concepts in system development.</w:t>
-      </w:r>
-    </w:p>
-    <w:p/>
+        <w:t xml:space="preserve">My personal portfolio </w:t>
+      </w:r>
+      <w:r>
+        <w:t xml:space="preserve"> </w:t>
+      </w:r>
+      <w:r>
+        <w:rPr>
+          <w:b/>
+          <w:bCs/>
+        </w:rPr>
+        <w:t>https://arisiimadaisy-glitch.github.io/DAISY-s-Portfolio</w:t>
+      </w:r>
+    </w:p>
     <w:p>
       <w:pPr>
         <w:rPr>
@@ -560,7 +665,7 @@
         </w:numPr>
       </w:pPr>
       <w:r>
-        <w:t>Quick learner</w:t>
+        <w:t>Time management</w:t>
       </w:r>
     </w:p>
     <w:p>
@@ -571,7 +676,7 @@
         </w:numPr>
       </w:pPr>
       <w:r>
-        <w:t>Time management</w:t>
+        <w:t>Problem-solving abilities</w:t>
       </w:r>
     </w:p>
     <w:p>
@@ -582,7 +687,7 @@
         </w:numPr>
       </w:pPr>
       <w:r>
-        <w:t>Problem-solving abilities</w:t>
+        <w:t>Hardworking and self-motivated</w:t>
       </w:r>
     </w:p>
     <w:p>
@@ -593,7 +698,7 @@
         </w:numPr>
       </w:pPr>
       <w:r>
-        <w:t>Hardworking and self-motivated</w:t>
+        <w:t>Adaptability and willingness to learn</w:t>
       </w:r>
     </w:p>
     <w:p/>
@@ -729,29 +834,29 @@
           <w:b/>
           <w:bCs/>
         </w:rPr>
-        <w:t>REFERENCES</w:t>
-      </w:r>
-    </w:p>
-    <w:p>
-      <w:pPr>
-        <w:rPr>
-          <w:b/>
-          <w:bCs/>
-        </w:rPr>
-      </w:pPr>
-      <w:r>
-        <w:rPr>
-          <w:b/>
-          <w:bCs/>
-        </w:rPr>
-        <w:t>MR MUGISHA</w:t>
-      </w:r>
-      <w:r>
-        <w:rPr>
-          <w:b/>
-          <w:bCs/>
-        </w:rPr>
-        <w:t xml:space="preserve"> KENNETH</w:t>
+        <w:t>REFER</w:t>
+      </w:r>
+      <w:r>
+        <w:rPr>
+          <w:b/>
+          <w:bCs/>
+        </w:rPr>
+        <w:t>EES :</w:t>
+      </w:r>
+    </w:p>
+    <w:p>
+      <w:pPr>
+        <w:rPr>
+          <w:b/>
+          <w:bCs/>
+        </w:rPr>
+      </w:pPr>
+      <w:r>
+        <w:rPr>
+          <w:b/>
+          <w:bCs/>
+        </w:rPr>
+        <w:t>MISS JOYCE WANDEKA</w:t>
       </w:r>
     </w:p>
     <w:p>
@@ -762,47 +867,23 @@
         <w:br/>
       </w:r>
       <w:r>
-        <w:t>UICT</w:t>
+        <w:t>U</w:t>
+      </w:r>
+      <w:r>
+        <w:t xml:space="preserve">ganda Institute Of </w:t>
+      </w:r>
+      <w:r>
+        <w:t>ICT</w:t>
       </w:r>
       <w:r>
         <w:br/>
         <w:t xml:space="preserve">Phone: </w:t>
       </w:r>
       <w:r>
-        <w:t>0741043348</w:t>
-      </w:r>
-    </w:p>
-    <w:p>
-      <w:pPr>
-        <w:rPr>
-          <w:b/>
-          <w:bCs/>
-        </w:rPr>
-      </w:pPr>
-      <w:r>
-        <w:rPr>
-          <w:b/>
-          <w:bCs/>
-        </w:rPr>
-        <w:t>MISS JOYCE WANDEKA</w:t>
-      </w:r>
-    </w:p>
-    <w:p>
-      <w:r>
-        <w:t>LECTURER</w:t>
-      </w:r>
-      <w:r>
-        <w:br/>
-      </w:r>
-      <w:r>
-        <w:t>UICT</w:t>
-      </w:r>
-      <w:r>
-        <w:br/>
-        <w:t xml:space="preserve">Phone: </w:t>
-      </w:r>
-      <w:r>
-        <w:t>0774327556</w:t>
+        <w:t>+256</w:t>
+      </w:r>
+      <w:r>
+        <w:t>774327556</w:t>
       </w:r>
     </w:p>
     <w:p/>
@@ -932,6 +1013,304 @@
     </w:lvl>
   </w:abstractNum>
   <w:abstractNum w:abstractNumId="1" w15:restartNumberingAfterBreak="0">
+    <w:nsid w:val="20CB3FB0"/>
+    <w:multiLevelType w:val="multilevel"/>
+    <w:tmpl w:val="FC6C6418"/>
+    <w:lvl w:ilvl="0">
+      <w:start w:val="1"/>
+      <w:numFmt w:val="bullet"/>
+      <w:lvlText w:val=""/>
+      <w:lvlJc w:val="left"/>
+      <w:pPr>
+        <w:tabs>
+          <w:tab w:val="num" w:pos="720"/>
+        </w:tabs>
+        <w:ind w:left="720" w:hanging="360"/>
+      </w:pPr>
+      <w:rPr>
+        <w:rFonts w:ascii="Symbol" w:hAnsi="Symbol" w:hint="default"/>
+        <w:sz w:val="20"/>
+      </w:rPr>
+    </w:lvl>
+    <w:lvl w:ilvl="1" w:tentative="1">
+      <w:start w:val="1"/>
+      <w:numFmt w:val="bullet"/>
+      <w:lvlText w:val="o"/>
+      <w:lvlJc w:val="left"/>
+      <w:pPr>
+        <w:tabs>
+          <w:tab w:val="num" w:pos="1440"/>
+        </w:tabs>
+        <w:ind w:left="1440" w:hanging="360"/>
+      </w:pPr>
+      <w:rPr>
+        <w:rFonts w:ascii="Courier New" w:hAnsi="Courier New" w:hint="default"/>
+        <w:sz w:val="20"/>
+      </w:rPr>
+    </w:lvl>
+    <w:lvl w:ilvl="2" w:tentative="1">
+      <w:start w:val="1"/>
+      <w:numFmt w:val="bullet"/>
+      <w:lvlText w:val=""/>
+      <w:lvlJc w:val="left"/>
+      <w:pPr>
+        <w:tabs>
+          <w:tab w:val="num" w:pos="2160"/>
+        </w:tabs>
+        <w:ind w:left="2160" w:hanging="360"/>
+      </w:pPr>
+      <w:rPr>
+        <w:rFonts w:ascii="Wingdings" w:hAnsi="Wingdings" w:hint="default"/>
+        <w:sz w:val="20"/>
+      </w:rPr>
+    </w:lvl>
+    <w:lvl w:ilvl="3" w:tentative="1">
+      <w:start w:val="1"/>
+      <w:numFmt w:val="bullet"/>
+      <w:lvlText w:val=""/>
+      <w:lvlJc w:val="left"/>
+      <w:pPr>
+        <w:tabs>
+          <w:tab w:val="num" w:pos="2880"/>
+        </w:tabs>
+        <w:ind w:left="2880" w:hanging="360"/>
+      </w:pPr>
+      <w:rPr>
+        <w:rFonts w:ascii="Wingdings" w:hAnsi="Wingdings" w:hint="default"/>
+        <w:sz w:val="20"/>
+      </w:rPr>
+    </w:lvl>
+    <w:lvl w:ilvl="4" w:tentative="1">
+      <w:start w:val="1"/>
+      <w:numFmt w:val="bullet"/>
+      <w:lvlText w:val=""/>
+      <w:lvlJc w:val="left"/>
+      <w:pPr>
+        <w:tabs>
+          <w:tab w:val="num" w:pos="3600"/>
+        </w:tabs>
+        <w:ind w:left="3600" w:hanging="360"/>
+      </w:pPr>
+      <w:rPr>
+        <w:rFonts w:ascii="Wingdings" w:hAnsi="Wingdings" w:hint="default"/>
+        <w:sz w:val="20"/>
+      </w:rPr>
+    </w:lvl>
+    <w:lvl w:ilvl="5" w:tentative="1">
+      <w:start w:val="1"/>
+      <w:numFmt w:val="bullet"/>
+      <w:lvlText w:val=""/>
+      <w:lvlJc w:val="left"/>
+      <w:pPr>
+        <w:tabs>
+          <w:tab w:val="num" w:pos="4320"/>
+        </w:tabs>
+        <w:ind w:left="4320" w:hanging="360"/>
+      </w:pPr>
+      <w:rPr>
+        <w:rFonts w:ascii="Wingdings" w:hAnsi="Wingdings" w:hint="default"/>
+        <w:sz w:val="20"/>
+      </w:rPr>
+    </w:lvl>
+    <w:lvl w:ilvl="6" w:tentative="1">
+      <w:start w:val="1"/>
+      <w:numFmt w:val="bullet"/>
+      <w:lvlText w:val=""/>
+      <w:lvlJc w:val="left"/>
+      <w:pPr>
+        <w:tabs>
+          <w:tab w:val="num" w:pos="5040"/>
+        </w:tabs>
+        <w:ind w:left="5040" w:hanging="360"/>
+      </w:pPr>
+      <w:rPr>
+        <w:rFonts w:ascii="Wingdings" w:hAnsi="Wingdings" w:hint="default"/>
+        <w:sz w:val="20"/>
+      </w:rPr>
+    </w:lvl>
+    <w:lvl w:ilvl="7" w:tentative="1">
+      <w:start w:val="1"/>
+      <w:numFmt w:val="bullet"/>
+      <w:lvlText w:val=""/>
+      <w:lvlJc w:val="left"/>
+      <w:pPr>
+        <w:tabs>
+          <w:tab w:val="num" w:pos="5760"/>
+        </w:tabs>
+        <w:ind w:left="5760" w:hanging="360"/>
+      </w:pPr>
+      <w:rPr>
+        <w:rFonts w:ascii="Wingdings" w:hAnsi="Wingdings" w:hint="default"/>
+        <w:sz w:val="20"/>
+      </w:rPr>
+    </w:lvl>
+    <w:lvl w:ilvl="8" w:tentative="1">
+      <w:start w:val="1"/>
+      <w:numFmt w:val="bullet"/>
+      <w:lvlText w:val=""/>
+      <w:lvlJc w:val="left"/>
+      <w:pPr>
+        <w:tabs>
+          <w:tab w:val="num" w:pos="6480"/>
+        </w:tabs>
+        <w:ind w:left="6480" w:hanging="360"/>
+      </w:pPr>
+      <w:rPr>
+        <w:rFonts w:ascii="Wingdings" w:hAnsi="Wingdings" w:hint="default"/>
+        <w:sz w:val="20"/>
+      </w:rPr>
+    </w:lvl>
+  </w:abstractNum>
+  <w:abstractNum w:abstractNumId="2" w15:restartNumberingAfterBreak="0">
+    <w:nsid w:val="2602499E"/>
+    <w:multiLevelType w:val="multilevel"/>
+    <w:tmpl w:val="CC42ACC4"/>
+    <w:lvl w:ilvl="0">
+      <w:start w:val="1"/>
+      <w:numFmt w:val="bullet"/>
+      <w:lvlText w:val=""/>
+      <w:lvlJc w:val="left"/>
+      <w:pPr>
+        <w:tabs>
+          <w:tab w:val="num" w:pos="720"/>
+        </w:tabs>
+        <w:ind w:left="720" w:hanging="360"/>
+      </w:pPr>
+      <w:rPr>
+        <w:rFonts w:ascii="Symbol" w:hAnsi="Symbol" w:hint="default"/>
+        <w:sz w:val="20"/>
+      </w:rPr>
+    </w:lvl>
+    <w:lvl w:ilvl="1" w:tentative="1">
+      <w:start w:val="1"/>
+      <w:numFmt w:val="bullet"/>
+      <w:lvlText w:val="o"/>
+      <w:lvlJc w:val="left"/>
+      <w:pPr>
+        <w:tabs>
+          <w:tab w:val="num" w:pos="1440"/>
+        </w:tabs>
+        <w:ind w:left="1440" w:hanging="360"/>
+      </w:pPr>
+      <w:rPr>
+        <w:rFonts w:ascii="Courier New" w:hAnsi="Courier New" w:hint="default"/>
+        <w:sz w:val="20"/>
+      </w:rPr>
+    </w:lvl>
+    <w:lvl w:ilvl="2" w:tentative="1">
+      <w:start w:val="1"/>
+      <w:numFmt w:val="bullet"/>
+      <w:lvlText w:val=""/>
+      <w:lvlJc w:val="left"/>
+      <w:pPr>
+        <w:tabs>
+          <w:tab w:val="num" w:pos="2160"/>
+        </w:tabs>
+        <w:ind w:left="2160" w:hanging="360"/>
+      </w:pPr>
+      <w:rPr>
+        <w:rFonts w:ascii="Wingdings" w:hAnsi="Wingdings" w:hint="default"/>
+        <w:sz w:val="20"/>
+      </w:rPr>
+    </w:lvl>
+    <w:lvl w:ilvl="3" w:tentative="1">
+      <w:start w:val="1"/>
+      <w:numFmt w:val="bullet"/>
+      <w:lvlText w:val=""/>
+      <w:lvlJc w:val="left"/>
+      <w:pPr>
+        <w:tabs>
+          <w:tab w:val="num" w:pos="2880"/>
+        </w:tabs>
+        <w:ind w:left="2880" w:hanging="360"/>
+      </w:pPr>
+      <w:rPr>
+        <w:rFonts w:ascii="Wingdings" w:hAnsi="Wingdings" w:hint="default"/>
+        <w:sz w:val="20"/>
+      </w:rPr>
+    </w:lvl>
+    <w:lvl w:ilvl="4" w:tentative="1">
+      <w:start w:val="1"/>
+      <w:numFmt w:val="bullet"/>
+      <w:lvlText w:val=""/>
+      <w:lvlJc w:val="left"/>
+      <w:pPr>
+        <w:tabs>
+          <w:tab w:val="num" w:pos="3600"/>
+        </w:tabs>
+        <w:ind w:left="3600" w:hanging="360"/>
+      </w:pPr>
+      <w:rPr>
+        <w:rFonts w:ascii="Wingdings" w:hAnsi="Wingdings" w:hint="default"/>
+        <w:sz w:val="20"/>
+      </w:rPr>
+    </w:lvl>
+    <w:lvl w:ilvl="5" w:tentative="1">
+      <w:start w:val="1"/>
+      <w:numFmt w:val="bullet"/>
+      <w:lvlText w:val=""/>
+      <w:lvlJc w:val="left"/>
+      <w:pPr>
+        <w:tabs>
+          <w:tab w:val="num" w:pos="4320"/>
+        </w:tabs>
+        <w:ind w:left="4320" w:hanging="360"/>
+      </w:pPr>
+      <w:rPr>
+        <w:rFonts w:ascii="Wingdings" w:hAnsi="Wingdings" w:hint="default"/>
+        <w:sz w:val="20"/>
+      </w:rPr>
+    </w:lvl>
+    <w:lvl w:ilvl="6" w:tentative="1">
+      <w:start w:val="1"/>
+      <w:numFmt w:val="bullet"/>
+      <w:lvlText w:val=""/>
+      <w:lvlJc w:val="left"/>
+      <w:pPr>
+        <w:tabs>
+          <w:tab w:val="num" w:pos="5040"/>
+        </w:tabs>
+        <w:ind w:left="5040" w:hanging="360"/>
+      </w:pPr>
+      <w:rPr>
+        <w:rFonts w:ascii="Wingdings" w:hAnsi="Wingdings" w:hint="default"/>
+        <w:sz w:val="20"/>
+      </w:rPr>
+    </w:lvl>
+    <w:lvl w:ilvl="7" w:tentative="1">
+      <w:start w:val="1"/>
+      <w:numFmt w:val="bullet"/>
+      <w:lvlText w:val=""/>
+      <w:lvlJc w:val="left"/>
+      <w:pPr>
+        <w:tabs>
+          <w:tab w:val="num" w:pos="5760"/>
+        </w:tabs>
+        <w:ind w:left="5760" w:hanging="360"/>
+      </w:pPr>
+      <w:rPr>
+        <w:rFonts w:ascii="Wingdings" w:hAnsi="Wingdings" w:hint="default"/>
+        <w:sz w:val="20"/>
+      </w:rPr>
+    </w:lvl>
+    <w:lvl w:ilvl="8" w:tentative="1">
+      <w:start w:val="1"/>
+      <w:numFmt w:val="bullet"/>
+      <w:lvlText w:val=""/>
+      <w:lvlJc w:val="left"/>
+      <w:pPr>
+        <w:tabs>
+          <w:tab w:val="num" w:pos="6480"/>
+        </w:tabs>
+        <w:ind w:left="6480" w:hanging="360"/>
+      </w:pPr>
+      <w:rPr>
+        <w:rFonts w:ascii="Wingdings" w:hAnsi="Wingdings" w:hint="default"/>
+        <w:sz w:val="20"/>
+      </w:rPr>
+    </w:lvl>
+  </w:abstractNum>
+  <w:abstractNum w:abstractNumId="3" w15:restartNumberingAfterBreak="0">
     <w:nsid w:val="274E2505"/>
     <w:multiLevelType w:val="multilevel"/>
     <w:tmpl w:val="E5DE18EC"/>
@@ -1080,7 +1459,305 @@
       </w:rPr>
     </w:lvl>
   </w:abstractNum>
-  <w:abstractNum w:abstractNumId="2" w15:restartNumberingAfterBreak="0">
+  <w:abstractNum w:abstractNumId="4" w15:restartNumberingAfterBreak="0">
+    <w:nsid w:val="2E595046"/>
+    <w:multiLevelType w:val="multilevel"/>
+    <w:tmpl w:val="AEC2EAA6"/>
+    <w:lvl w:ilvl="0">
+      <w:start w:val="1"/>
+      <w:numFmt w:val="bullet"/>
+      <w:lvlText w:val=""/>
+      <w:lvlJc w:val="left"/>
+      <w:pPr>
+        <w:tabs>
+          <w:tab w:val="num" w:pos="720"/>
+        </w:tabs>
+        <w:ind w:left="720" w:hanging="360"/>
+      </w:pPr>
+      <w:rPr>
+        <w:rFonts w:ascii="Symbol" w:hAnsi="Symbol" w:hint="default"/>
+        <w:sz w:val="20"/>
+      </w:rPr>
+    </w:lvl>
+    <w:lvl w:ilvl="1" w:tentative="1">
+      <w:start w:val="1"/>
+      <w:numFmt w:val="bullet"/>
+      <w:lvlText w:val="o"/>
+      <w:lvlJc w:val="left"/>
+      <w:pPr>
+        <w:tabs>
+          <w:tab w:val="num" w:pos="1440"/>
+        </w:tabs>
+        <w:ind w:left="1440" w:hanging="360"/>
+      </w:pPr>
+      <w:rPr>
+        <w:rFonts w:ascii="Courier New" w:hAnsi="Courier New" w:hint="default"/>
+        <w:sz w:val="20"/>
+      </w:rPr>
+    </w:lvl>
+    <w:lvl w:ilvl="2" w:tentative="1">
+      <w:start w:val="1"/>
+      <w:numFmt w:val="bullet"/>
+      <w:lvlText w:val=""/>
+      <w:lvlJc w:val="left"/>
+      <w:pPr>
+        <w:tabs>
+          <w:tab w:val="num" w:pos="2160"/>
+        </w:tabs>
+        <w:ind w:left="2160" w:hanging="360"/>
+      </w:pPr>
+      <w:rPr>
+        <w:rFonts w:ascii="Wingdings" w:hAnsi="Wingdings" w:hint="default"/>
+        <w:sz w:val="20"/>
+      </w:rPr>
+    </w:lvl>
+    <w:lvl w:ilvl="3" w:tentative="1">
+      <w:start w:val="1"/>
+      <w:numFmt w:val="bullet"/>
+      <w:lvlText w:val=""/>
+      <w:lvlJc w:val="left"/>
+      <w:pPr>
+        <w:tabs>
+          <w:tab w:val="num" w:pos="2880"/>
+        </w:tabs>
+        <w:ind w:left="2880" w:hanging="360"/>
+      </w:pPr>
+      <w:rPr>
+        <w:rFonts w:ascii="Wingdings" w:hAnsi="Wingdings" w:hint="default"/>
+        <w:sz w:val="20"/>
+      </w:rPr>
+    </w:lvl>
+    <w:lvl w:ilvl="4" w:tentative="1">
+      <w:start w:val="1"/>
+      <w:numFmt w:val="bullet"/>
+      <w:lvlText w:val=""/>
+      <w:lvlJc w:val="left"/>
+      <w:pPr>
+        <w:tabs>
+          <w:tab w:val="num" w:pos="3600"/>
+        </w:tabs>
+        <w:ind w:left="3600" w:hanging="360"/>
+      </w:pPr>
+      <w:rPr>
+        <w:rFonts w:ascii="Wingdings" w:hAnsi="Wingdings" w:hint="default"/>
+        <w:sz w:val="20"/>
+      </w:rPr>
+    </w:lvl>
+    <w:lvl w:ilvl="5" w:tentative="1">
+      <w:start w:val="1"/>
+      <w:numFmt w:val="bullet"/>
+      <w:lvlText w:val=""/>
+      <w:lvlJc w:val="left"/>
+      <w:pPr>
+        <w:tabs>
+          <w:tab w:val="num" w:pos="4320"/>
+        </w:tabs>
+        <w:ind w:left="4320" w:hanging="360"/>
+      </w:pPr>
+      <w:rPr>
+        <w:rFonts w:ascii="Wingdings" w:hAnsi="Wingdings" w:hint="default"/>
+        <w:sz w:val="20"/>
+      </w:rPr>
+    </w:lvl>
+    <w:lvl w:ilvl="6" w:tentative="1">
+      <w:start w:val="1"/>
+      <w:numFmt w:val="bullet"/>
+      <w:lvlText w:val=""/>
+      <w:lvlJc w:val="left"/>
+      <w:pPr>
+        <w:tabs>
+          <w:tab w:val="num" w:pos="5040"/>
+        </w:tabs>
+        <w:ind w:left="5040" w:hanging="360"/>
+      </w:pPr>
+      <w:rPr>
+        <w:rFonts w:ascii="Wingdings" w:hAnsi="Wingdings" w:hint="default"/>
+        <w:sz w:val="20"/>
+      </w:rPr>
+    </w:lvl>
+    <w:lvl w:ilvl="7" w:tentative="1">
+      <w:start w:val="1"/>
+      <w:numFmt w:val="bullet"/>
+      <w:lvlText w:val=""/>
+      <w:lvlJc w:val="left"/>
+      <w:pPr>
+        <w:tabs>
+          <w:tab w:val="num" w:pos="5760"/>
+        </w:tabs>
+        <w:ind w:left="5760" w:hanging="360"/>
+      </w:pPr>
+      <w:rPr>
+        <w:rFonts w:ascii="Wingdings" w:hAnsi="Wingdings" w:hint="default"/>
+        <w:sz w:val="20"/>
+      </w:rPr>
+    </w:lvl>
+    <w:lvl w:ilvl="8" w:tentative="1">
+      <w:start w:val="1"/>
+      <w:numFmt w:val="bullet"/>
+      <w:lvlText w:val=""/>
+      <w:lvlJc w:val="left"/>
+      <w:pPr>
+        <w:tabs>
+          <w:tab w:val="num" w:pos="6480"/>
+        </w:tabs>
+        <w:ind w:left="6480" w:hanging="360"/>
+      </w:pPr>
+      <w:rPr>
+        <w:rFonts w:ascii="Wingdings" w:hAnsi="Wingdings" w:hint="default"/>
+        <w:sz w:val="20"/>
+      </w:rPr>
+    </w:lvl>
+  </w:abstractNum>
+  <w:abstractNum w:abstractNumId="5" w15:restartNumberingAfterBreak="0">
+    <w:nsid w:val="5938042F"/>
+    <w:multiLevelType w:val="multilevel"/>
+    <w:tmpl w:val="44528E00"/>
+    <w:lvl w:ilvl="0">
+      <w:start w:val="1"/>
+      <w:numFmt w:val="bullet"/>
+      <w:lvlText w:val=""/>
+      <w:lvlJc w:val="left"/>
+      <w:pPr>
+        <w:tabs>
+          <w:tab w:val="num" w:pos="720"/>
+        </w:tabs>
+        <w:ind w:left="720" w:hanging="360"/>
+      </w:pPr>
+      <w:rPr>
+        <w:rFonts w:ascii="Symbol" w:hAnsi="Symbol" w:hint="default"/>
+        <w:sz w:val="20"/>
+      </w:rPr>
+    </w:lvl>
+    <w:lvl w:ilvl="1" w:tentative="1">
+      <w:start w:val="1"/>
+      <w:numFmt w:val="bullet"/>
+      <w:lvlText w:val="o"/>
+      <w:lvlJc w:val="left"/>
+      <w:pPr>
+        <w:tabs>
+          <w:tab w:val="num" w:pos="1440"/>
+        </w:tabs>
+        <w:ind w:left="1440" w:hanging="360"/>
+      </w:pPr>
+      <w:rPr>
+        <w:rFonts w:ascii="Courier New" w:hAnsi="Courier New" w:hint="default"/>
+        <w:sz w:val="20"/>
+      </w:rPr>
+    </w:lvl>
+    <w:lvl w:ilvl="2" w:tentative="1">
+      <w:start w:val="1"/>
+      <w:numFmt w:val="bullet"/>
+      <w:lvlText w:val=""/>
+      <w:lvlJc w:val="left"/>
+      <w:pPr>
+        <w:tabs>
+          <w:tab w:val="num" w:pos="2160"/>
+        </w:tabs>
+        <w:ind w:left="2160" w:hanging="360"/>
+      </w:pPr>
+      <w:rPr>
+        <w:rFonts w:ascii="Wingdings" w:hAnsi="Wingdings" w:hint="default"/>
+        <w:sz w:val="20"/>
+      </w:rPr>
+    </w:lvl>
+    <w:lvl w:ilvl="3" w:tentative="1">
+      <w:start w:val="1"/>
+      <w:numFmt w:val="bullet"/>
+      <w:lvlText w:val=""/>
+      <w:lvlJc w:val="left"/>
+      <w:pPr>
+        <w:tabs>
+          <w:tab w:val="num" w:pos="2880"/>
+        </w:tabs>
+        <w:ind w:left="2880" w:hanging="360"/>
+      </w:pPr>
+      <w:rPr>
+        <w:rFonts w:ascii="Wingdings" w:hAnsi="Wingdings" w:hint="default"/>
+        <w:sz w:val="20"/>
+      </w:rPr>
+    </w:lvl>
+    <w:lvl w:ilvl="4" w:tentative="1">
+      <w:start w:val="1"/>
+      <w:numFmt w:val="bullet"/>
+      <w:lvlText w:val=""/>
+      <w:lvlJc w:val="left"/>
+      <w:pPr>
+        <w:tabs>
+          <w:tab w:val="num" w:pos="3600"/>
+        </w:tabs>
+        <w:ind w:left="3600" w:hanging="360"/>
+      </w:pPr>
+      <w:rPr>
+        <w:rFonts w:ascii="Wingdings" w:hAnsi="Wingdings" w:hint="default"/>
+        <w:sz w:val="20"/>
+      </w:rPr>
+    </w:lvl>
+    <w:lvl w:ilvl="5" w:tentative="1">
+      <w:start w:val="1"/>
+      <w:numFmt w:val="bullet"/>
+      <w:lvlText w:val=""/>
+      <w:lvlJc w:val="left"/>
+      <w:pPr>
+        <w:tabs>
+          <w:tab w:val="num" w:pos="4320"/>
+        </w:tabs>
+        <w:ind w:left="4320" w:hanging="360"/>
+      </w:pPr>
+      <w:rPr>
+        <w:rFonts w:ascii="Wingdings" w:hAnsi="Wingdings" w:hint="default"/>
+        <w:sz w:val="20"/>
+      </w:rPr>
+    </w:lvl>
+    <w:lvl w:ilvl="6" w:tentative="1">
+      <w:start w:val="1"/>
+      <w:numFmt w:val="bullet"/>
+      <w:lvlText w:val=""/>
+      <w:lvlJc w:val="left"/>
+      <w:pPr>
+        <w:tabs>
+          <w:tab w:val="num" w:pos="5040"/>
+        </w:tabs>
+        <w:ind w:left="5040" w:hanging="360"/>
+      </w:pPr>
+      <w:rPr>
+        <w:rFonts w:ascii="Wingdings" w:hAnsi="Wingdings" w:hint="default"/>
+        <w:sz w:val="20"/>
+      </w:rPr>
+    </w:lvl>
+    <w:lvl w:ilvl="7" w:tentative="1">
+      <w:start w:val="1"/>
+      <w:numFmt w:val="bullet"/>
+      <w:lvlText w:val=""/>
+      <w:lvlJc w:val="left"/>
+      <w:pPr>
+        <w:tabs>
+          <w:tab w:val="num" w:pos="5760"/>
+        </w:tabs>
+        <w:ind w:left="5760" w:hanging="360"/>
+      </w:pPr>
+      <w:rPr>
+        <w:rFonts w:ascii="Wingdings" w:hAnsi="Wingdings" w:hint="default"/>
+        <w:sz w:val="20"/>
+      </w:rPr>
+    </w:lvl>
+    <w:lvl w:ilvl="8" w:tentative="1">
+      <w:start w:val="1"/>
+      <w:numFmt w:val="bullet"/>
+      <w:lvlText w:val=""/>
+      <w:lvlJc w:val="left"/>
+      <w:pPr>
+        <w:tabs>
+          <w:tab w:val="num" w:pos="6480"/>
+        </w:tabs>
+        <w:ind w:left="6480" w:hanging="360"/>
+      </w:pPr>
+      <w:rPr>
+        <w:rFonts w:ascii="Wingdings" w:hAnsi="Wingdings" w:hint="default"/>
+        <w:sz w:val="20"/>
+      </w:rPr>
+    </w:lvl>
+  </w:abstractNum>
+  <w:abstractNum w:abstractNumId="6" w15:restartNumberingAfterBreak="0">
     <w:nsid w:val="598B7847"/>
     <w:multiLevelType w:val="multilevel"/>
     <w:tmpl w:val="113212A0"/>
@@ -1229,7 +1906,7 @@
       </w:rPr>
     </w:lvl>
   </w:abstractNum>
-  <w:abstractNum w:abstractNumId="3" w15:restartNumberingAfterBreak="0">
+  <w:abstractNum w:abstractNumId="7" w15:restartNumberingAfterBreak="0">
     <w:nsid w:val="5EE55254"/>
     <w:multiLevelType w:val="multilevel"/>
     <w:tmpl w:val="6344976E"/>
@@ -1378,7 +2055,7 @@
       </w:rPr>
     </w:lvl>
   </w:abstractNum>
-  <w:abstractNum w:abstractNumId="4" w15:restartNumberingAfterBreak="0">
+  <w:abstractNum w:abstractNumId="8" w15:restartNumberingAfterBreak="0">
     <w:nsid w:val="623A1AFD"/>
     <w:multiLevelType w:val="multilevel"/>
     <w:tmpl w:val="002AB794"/>
@@ -1527,7 +2204,156 @@
       </w:rPr>
     </w:lvl>
   </w:abstractNum>
-  <w:abstractNum w:abstractNumId="5" w15:restartNumberingAfterBreak="0">
+  <w:abstractNum w:abstractNumId="9" w15:restartNumberingAfterBreak="0">
+    <w:nsid w:val="6C037B5D"/>
+    <w:multiLevelType w:val="multilevel"/>
+    <w:tmpl w:val="E0769388"/>
+    <w:lvl w:ilvl="0">
+      <w:start w:val="1"/>
+      <w:numFmt w:val="bullet"/>
+      <w:lvlText w:val=""/>
+      <w:lvlJc w:val="left"/>
+      <w:pPr>
+        <w:tabs>
+          <w:tab w:val="num" w:pos="720"/>
+        </w:tabs>
+        <w:ind w:left="720" w:hanging="360"/>
+      </w:pPr>
+      <w:rPr>
+        <w:rFonts w:ascii="Symbol" w:hAnsi="Symbol" w:hint="default"/>
+        <w:sz w:val="20"/>
+      </w:rPr>
+    </w:lvl>
+    <w:lvl w:ilvl="1" w:tentative="1">
+      <w:start w:val="1"/>
+      <w:numFmt w:val="bullet"/>
+      <w:lvlText w:val="o"/>
+      <w:lvlJc w:val="left"/>
+      <w:pPr>
+        <w:tabs>
+          <w:tab w:val="num" w:pos="1440"/>
+        </w:tabs>
+        <w:ind w:left="1440" w:hanging="360"/>
+      </w:pPr>
+      <w:rPr>
+        <w:rFonts w:ascii="Courier New" w:hAnsi="Courier New" w:hint="default"/>
+        <w:sz w:val="20"/>
+      </w:rPr>
+    </w:lvl>
+    <w:lvl w:ilvl="2" w:tentative="1">
+      <w:start w:val="1"/>
+      <w:numFmt w:val="bullet"/>
+      <w:lvlText w:val=""/>
+      <w:lvlJc w:val="left"/>
+      <w:pPr>
+        <w:tabs>
+          <w:tab w:val="num" w:pos="2160"/>
+        </w:tabs>
+        <w:ind w:left="2160" w:hanging="360"/>
+      </w:pPr>
+      <w:rPr>
+        <w:rFonts w:ascii="Wingdings" w:hAnsi="Wingdings" w:hint="default"/>
+        <w:sz w:val="20"/>
+      </w:rPr>
+    </w:lvl>
+    <w:lvl w:ilvl="3" w:tentative="1">
+      <w:start w:val="1"/>
+      <w:numFmt w:val="bullet"/>
+      <w:lvlText w:val=""/>
+      <w:lvlJc w:val="left"/>
+      <w:pPr>
+        <w:tabs>
+          <w:tab w:val="num" w:pos="2880"/>
+        </w:tabs>
+        <w:ind w:left="2880" w:hanging="360"/>
+      </w:pPr>
+      <w:rPr>
+        <w:rFonts w:ascii="Wingdings" w:hAnsi="Wingdings" w:hint="default"/>
+        <w:sz w:val="20"/>
+      </w:rPr>
+    </w:lvl>
+    <w:lvl w:ilvl="4" w:tentative="1">
+      <w:start w:val="1"/>
+      <w:numFmt w:val="bullet"/>
+      <w:lvlText w:val=""/>
+      <w:lvlJc w:val="left"/>
+      <w:pPr>
+        <w:tabs>
+          <w:tab w:val="num" w:pos="3600"/>
+        </w:tabs>
+        <w:ind w:left="3600" w:hanging="360"/>
+      </w:pPr>
+      <w:rPr>
+        <w:rFonts w:ascii="Wingdings" w:hAnsi="Wingdings" w:hint="default"/>
+        <w:sz w:val="20"/>
+      </w:rPr>
+    </w:lvl>
+    <w:lvl w:ilvl="5" w:tentative="1">
+      <w:start w:val="1"/>
+      <w:numFmt w:val="bullet"/>
+      <w:lvlText w:val=""/>
+      <w:lvlJc w:val="left"/>
+      <w:pPr>
+        <w:tabs>
+          <w:tab w:val="num" w:pos="4320"/>
+        </w:tabs>
+        <w:ind w:left="4320" w:hanging="360"/>
+      </w:pPr>
+      <w:rPr>
+        <w:rFonts w:ascii="Wingdings" w:hAnsi="Wingdings" w:hint="default"/>
+        <w:sz w:val="20"/>
+      </w:rPr>
+    </w:lvl>
+    <w:lvl w:ilvl="6" w:tentative="1">
+      <w:start w:val="1"/>
+      <w:numFmt w:val="bullet"/>
+      <w:lvlText w:val=""/>
+      <w:lvlJc w:val="left"/>
+      <w:pPr>
+        <w:tabs>
+          <w:tab w:val="num" w:pos="5040"/>
+        </w:tabs>
+        <w:ind w:left="5040" w:hanging="360"/>
+      </w:pPr>
+      <w:rPr>
+        <w:rFonts w:ascii="Wingdings" w:hAnsi="Wingdings" w:hint="default"/>
+        <w:sz w:val="20"/>
+      </w:rPr>
+    </w:lvl>
+    <w:lvl w:ilvl="7" w:tentative="1">
+      <w:start w:val="1"/>
+      <w:numFmt w:val="bullet"/>
+      <w:lvlText w:val=""/>
+      <w:lvlJc w:val="left"/>
+      <w:pPr>
+        <w:tabs>
+          <w:tab w:val="num" w:pos="5760"/>
+        </w:tabs>
+        <w:ind w:left="5760" w:hanging="360"/>
+      </w:pPr>
+      <w:rPr>
+        <w:rFonts w:ascii="Wingdings" w:hAnsi="Wingdings" w:hint="default"/>
+        <w:sz w:val="20"/>
+      </w:rPr>
+    </w:lvl>
+    <w:lvl w:ilvl="8" w:tentative="1">
+      <w:start w:val="1"/>
+      <w:numFmt w:val="bullet"/>
+      <w:lvlText w:val=""/>
+      <w:lvlJc w:val="left"/>
+      <w:pPr>
+        <w:tabs>
+          <w:tab w:val="num" w:pos="6480"/>
+        </w:tabs>
+        <w:ind w:left="6480" w:hanging="360"/>
+      </w:pPr>
+      <w:rPr>
+        <w:rFonts w:ascii="Wingdings" w:hAnsi="Wingdings" w:hint="default"/>
+        <w:sz w:val="20"/>
+      </w:rPr>
+    </w:lvl>
+  </w:abstractNum>
+  <w:abstractNum w:abstractNumId="10" w15:restartNumberingAfterBreak="0">
     <w:nsid w:val="75691D69"/>
     <w:multiLevelType w:val="multilevel"/>
     <w:tmpl w:val="1A602BCC"/>
@@ -1676,23 +2502,154 @@
       </w:rPr>
     </w:lvl>
   </w:abstractNum>
+  <w:abstractNum w:abstractNumId="11" w15:restartNumberingAfterBreak="0">
+    <w:nsid w:val="7F454234"/>
+    <w:multiLevelType w:val="hybridMultilevel"/>
+    <w:tmpl w:val="01B01EBC"/>
+    <w:lvl w:ilvl="0" w:tplc="20000001">
+      <w:start w:val="1"/>
+      <w:numFmt w:val="bullet"/>
+      <w:lvlText w:val=""/>
+      <w:lvlJc w:val="left"/>
+      <w:pPr>
+        <w:ind w:left="720" w:hanging="360"/>
+      </w:pPr>
+      <w:rPr>
+        <w:rFonts w:ascii="Symbol" w:hAnsi="Symbol" w:hint="default"/>
+      </w:rPr>
+    </w:lvl>
+    <w:lvl w:ilvl="1" w:tplc="20000003" w:tentative="1">
+      <w:start w:val="1"/>
+      <w:numFmt w:val="bullet"/>
+      <w:lvlText w:val="o"/>
+      <w:lvlJc w:val="left"/>
+      <w:pPr>
+        <w:ind w:left="1440" w:hanging="360"/>
+      </w:pPr>
+      <w:rPr>
+        <w:rFonts w:ascii="Courier New" w:hAnsi="Courier New" w:cs="Courier New" w:hint="default"/>
+      </w:rPr>
+    </w:lvl>
+    <w:lvl w:ilvl="2" w:tplc="20000005" w:tentative="1">
+      <w:start w:val="1"/>
+      <w:numFmt w:val="bullet"/>
+      <w:lvlText w:val=""/>
+      <w:lvlJc w:val="left"/>
+      <w:pPr>
+        <w:ind w:left="2160" w:hanging="360"/>
+      </w:pPr>
+      <w:rPr>
+        <w:rFonts w:ascii="Wingdings" w:hAnsi="Wingdings" w:hint="default"/>
+      </w:rPr>
+    </w:lvl>
+    <w:lvl w:ilvl="3" w:tplc="20000001" w:tentative="1">
+      <w:start w:val="1"/>
+      <w:numFmt w:val="bullet"/>
+      <w:lvlText w:val=""/>
+      <w:lvlJc w:val="left"/>
+      <w:pPr>
+        <w:ind w:left="2880" w:hanging="360"/>
+      </w:pPr>
+      <w:rPr>
+        <w:rFonts w:ascii="Symbol" w:hAnsi="Symbol" w:hint="default"/>
+      </w:rPr>
+    </w:lvl>
+    <w:lvl w:ilvl="4" w:tplc="20000003" w:tentative="1">
+      <w:start w:val="1"/>
+      <w:numFmt w:val="bullet"/>
+      <w:lvlText w:val="o"/>
+      <w:lvlJc w:val="left"/>
+      <w:pPr>
+        <w:ind w:left="3600" w:hanging="360"/>
+      </w:pPr>
+      <w:rPr>
+        <w:rFonts w:ascii="Courier New" w:hAnsi="Courier New" w:cs="Courier New" w:hint="default"/>
+      </w:rPr>
+    </w:lvl>
+    <w:lvl w:ilvl="5" w:tplc="20000005" w:tentative="1">
+      <w:start w:val="1"/>
+      <w:numFmt w:val="bullet"/>
+      <w:lvlText w:val=""/>
+      <w:lvlJc w:val="left"/>
+      <w:pPr>
+        <w:ind w:left="4320" w:hanging="360"/>
+      </w:pPr>
+      <w:rPr>
+        <w:rFonts w:ascii="Wingdings" w:hAnsi="Wingdings" w:hint="default"/>
+      </w:rPr>
+    </w:lvl>
+    <w:lvl w:ilvl="6" w:tplc="20000001" w:tentative="1">
+      <w:start w:val="1"/>
+      <w:numFmt w:val="bullet"/>
+      <w:lvlText w:val=""/>
+      <w:lvlJc w:val="left"/>
+      <w:pPr>
+        <w:ind w:left="5040" w:hanging="360"/>
+      </w:pPr>
+      <w:rPr>
+        <w:rFonts w:ascii="Symbol" w:hAnsi="Symbol" w:hint="default"/>
+      </w:rPr>
+    </w:lvl>
+    <w:lvl w:ilvl="7" w:tplc="20000003" w:tentative="1">
+      <w:start w:val="1"/>
+      <w:numFmt w:val="bullet"/>
+      <w:lvlText w:val="o"/>
+      <w:lvlJc w:val="left"/>
+      <w:pPr>
+        <w:ind w:left="5760" w:hanging="360"/>
+      </w:pPr>
+      <w:rPr>
+        <w:rFonts w:ascii="Courier New" w:hAnsi="Courier New" w:cs="Courier New" w:hint="default"/>
+      </w:rPr>
+    </w:lvl>
+    <w:lvl w:ilvl="8" w:tplc="20000005" w:tentative="1">
+      <w:start w:val="1"/>
+      <w:numFmt w:val="bullet"/>
+      <w:lvlText w:val=""/>
+      <w:lvlJc w:val="left"/>
+      <w:pPr>
+        <w:ind w:left="6480" w:hanging="360"/>
+      </w:pPr>
+      <w:rPr>
+        <w:rFonts w:ascii="Wingdings" w:hAnsi="Wingdings" w:hint="default"/>
+      </w:rPr>
+    </w:lvl>
+  </w:abstractNum>
   <w:num w:numId="1" w16cid:durableId="651370052">
-    <w:abstractNumId w:val="4"/>
+    <w:abstractNumId w:val="8"/>
   </w:num>
   <w:num w:numId="2" w16cid:durableId="1723290268">
-    <w:abstractNumId w:val="2"/>
+    <w:abstractNumId w:val="6"/>
   </w:num>
   <w:num w:numId="3" w16cid:durableId="1580367639">
-    <w:abstractNumId w:val="5"/>
+    <w:abstractNumId w:val="10"/>
   </w:num>
   <w:num w:numId="4" w16cid:durableId="1627544973">
-    <w:abstractNumId w:val="3"/>
+    <w:abstractNumId w:val="7"/>
   </w:num>
   <w:num w:numId="5" w16cid:durableId="1024090368">
-    <w:abstractNumId w:val="1"/>
+    <w:abstractNumId w:val="3"/>
   </w:num>
   <w:num w:numId="6" w16cid:durableId="159545365">
     <w:abstractNumId w:val="0"/>
+  </w:num>
+  <w:num w:numId="7" w16cid:durableId="863327968">
+    <w:abstractNumId w:val="9"/>
+  </w:num>
+  <w:num w:numId="8" w16cid:durableId="804279302">
+    <w:abstractNumId w:val="1"/>
+  </w:num>
+  <w:num w:numId="9" w16cid:durableId="1177690131">
+    <w:abstractNumId w:val="2"/>
+  </w:num>
+  <w:num w:numId="10" w16cid:durableId="1254901726">
+    <w:abstractNumId w:val="4"/>
+  </w:num>
+  <w:num w:numId="11" w16cid:durableId="2090732734">
+    <w:abstractNumId w:val="5"/>
+  </w:num>
+  <w:num w:numId="12" w16cid:durableId="1315379134">
+    <w:abstractNumId w:val="11"/>
   </w:num>
 </w:numbering>
 </file>

</xml_diff>